<commit_message>
Workflow to build mac app
</commit_message>
<xml_diff>
--- a/SpectraSubtractionApp/Spectral Subtraction App Manual.docx
+++ b/SpectraSubtractionApp/Spectral Subtraction App Manual.docx
@@ -57,7 +57,7 @@
       </w:pPr>
     </w:p>
     <w:p>
-      <w:pPr>
+      <w:r>
         <w:rPr>
           <w:b/>
           <w:bCs/>
@@ -65,7 +65,10 @@
           <w:szCs w:val="28"/>
           <w:lang w:val="en-US"/>
         </w:rPr>
-      </w:pPr>
+        <w:t>INSTALLING THE APP</w:t>
+      </w:r>
+    </w:p>
+    <w:p>
       <w:r>
         <w:rPr>
           <w:b/>
@@ -74,7 +77,7 @@
           <w:szCs w:val="28"/>
           <w:lang w:val="en-US"/>
         </w:rPr>
-        <w:t>INSTALLING THE APP</w:t>
+        <w:t>FOR WINDOWS:</w:t>
       </w:r>
     </w:p>
     <w:p>
@@ -104,8 +107,985 @@
           <w:szCs w:val="28"/>
           <w:lang w:val="en-US"/>
         </w:rPr>
-        <w:t>arch folder navigate to the following folder</w:t>
-      </w:r>
+        <w:t xml:space="preserve">arch folder navigate to the </w:t>
+      </w:r>
+      <w:r>
+        <w:rPr>
+          <w:sz w:val="28"/>
+          <w:szCs w:val="28"/>
+          <w:lang w:val="en-US"/>
+        </w:rPr>
+        <w:t>SpectraSubtractionApp folder, you should see this</w:t>
+      </w:r>
+      <w:r>
+        <w:rPr>
+          <w:sz w:val="28"/>
+          <w:szCs w:val="28"/>
+          <w:lang w:val="en-US"/>
+        </w:rPr>
+        <w:t xml:space="preserve"> where you also got this manual</w:t>
+      </w:r>
+    </w:p>
+    <w:p>
+      <w:pPr>
+        <w:rPr>
+          <w:sz w:val="28"/>
+          <w:szCs w:val="28"/>
+          <w:lang w:val="en-US"/>
+        </w:rPr>
+      </w:pPr>
+      <w:r>
+        <w:rPr>
+          <w:sz w:val="28"/>
+          <w:szCs w:val="28"/>
+          <w:lang w:val="en-US"/>
+        </w:rPr>
+        <w:drawing>
+          <wp:inline distT="0" distB="0" distL="0" distR="0" wp14:anchorId="331B29B1" wp14:editId="0E74F474">
+            <wp:extent cx="5943600" cy="1188720"/>
+            <wp:effectExtent l="0" t="0" r="0" b="0"/>
+            <wp:docPr id="1798294961" name="Picture 1"/>
+            <wp:cNvGraphicFramePr>
+              <a:graphicFrameLocks xmlns:a="http://schemas.openxmlformats.org/drawingml/2006/main" noChangeAspect="1"/>
+            </wp:cNvGraphicFramePr>
+            <a:graphic xmlns:a="http://schemas.openxmlformats.org/drawingml/2006/main">
+              <a:graphicData uri="http://schemas.openxmlformats.org/drawingml/2006/picture">
+                <pic:pic xmlns:pic="http://schemas.openxmlformats.org/drawingml/2006/picture">
+                  <pic:nvPicPr>
+                    <pic:cNvPr id="1798294961" name=""/>
+                    <pic:cNvPicPr/>
+                  </pic:nvPicPr>
+                  <pic:blipFill>
+                    <a:blip r:embed="rId7"/>
+                    <a:stretch>
+                      <a:fillRect/>
+                    </a:stretch>
+                  </pic:blipFill>
+                  <pic:spPr>
+                    <a:xfrm>
+                      <a:off x="0" y="0"/>
+                      <a:ext cx="5943600" cy="1188720"/>
+                    </a:xfrm>
+                    <a:prstGeom prst="rect">
+                      <a:avLst/>
+                    </a:prstGeom>
+                  </pic:spPr>
+                </pic:pic>
+              </a:graphicData>
+            </a:graphic>
+          </wp:inline>
+        </w:drawing>
+      </w:r>
+    </w:p>
+    <w:p>
+      <w:pPr>
+        <w:pStyle w:val="ListParagraph"/>
+        <w:numPr>
+          <w:ilvl w:val="0"/>
+          <w:numId w:val="1"/>
+        </w:numPr>
+        <w:rPr>
+          <w:sz w:val="28"/>
+          <w:szCs w:val="28"/>
+          <w:lang w:val="en-US"/>
+        </w:rPr>
+      </w:pPr>
+      <w:r>
+        <w:rPr>
+          <w:sz w:val="28"/>
+          <w:szCs w:val="28"/>
+          <w:lang w:val="en-US"/>
+        </w:rPr>
+        <w:t>Click and Run SpectraSubtraction.exe, if you are prompted, press Run</w:t>
+      </w:r>
+    </w:p>
+    <w:p>
+      <w:r>
+        <w:rPr>
+          <w:b/>
+          <w:bCs/>
+          <w:sz w:val="28"/>
+          <w:szCs w:val="28"/>
+          <w:lang w:val="en-US"/>
+        </w:rPr>
+        <w:t>FOR MAC</w:t>
+      </w:r>
+      <w:r>
+        <w:rPr>
+          <w:b/>
+          <w:bCs/>
+          <w:sz w:val="28"/>
+          <w:szCs w:val="28"/>
+          <w:lang w:val="en-US"/>
+        </w:rPr>
+        <w:t xml:space="preserve"> (IF DOABLE)</w:t>
+      </w:r>
+      <w:r>
+        <w:rPr>
+          <w:b/>
+          <w:bCs/>
+          <w:sz w:val="28"/>
+          <w:szCs w:val="28"/>
+          <w:lang w:val="en-US"/>
+        </w:rPr>
+        <w:t>:</w:t>
+      </w:r>
+    </w:p>
+    <w:p>
+      <w:pPr>
+        <w:rPr>
+          <w:b/>
+          <w:sz w:val="28"/>
+          <w:szCs w:val="28"/>
+          <w:lang w:val="en-US"/>
+        </w:rPr>
+      </w:pPr>
+    </w:p>
+    <w:p>
+      <w:pPr>
+        <w:rPr>
+          <w:b/>
+          <w:bCs/>
+          <w:sz w:val="28"/>
+          <w:szCs w:val="28"/>
+          <w:lang w:val="en-US"/>
+        </w:rPr>
+      </w:pPr>
+      <w:r>
+        <w:rPr>
+          <w:b/>
+          <w:bCs/>
+          <w:sz w:val="28"/>
+          <w:szCs w:val="28"/>
+          <w:lang w:val="en-US"/>
+        </w:rPr>
+        <w:t>LOADING YOUR DATA</w:t>
+      </w:r>
+    </w:p>
+    <w:p>
+      <w:pPr>
+        <w:pStyle w:val="ListParagraph"/>
+        <w:numPr>
+          <w:ilvl w:val="0"/>
+          <w:numId w:val="2"/>
+        </w:numPr>
+        <w:spacing w:line="240" w:lineRule="auto"/>
+        <w:rPr>
+          <w:sz w:val="28"/>
+          <w:szCs w:val="28"/>
+          <w:lang w:val="en-US"/>
+        </w:rPr>
+      </w:pPr>
+      <w:r>
+        <w:rPr>
+          <w:sz w:val="28"/>
+          <w:szCs w:val="28"/>
+          <w:lang w:val="en-US"/>
+        </w:rPr>
+        <w:t>This is what you should see when you open the app:</w:t>
+      </w:r>
+    </w:p>
+    <w:p>
+      <w:pPr>
+        <w:spacing w:line="240" w:lineRule="auto"/>
+        <w:rPr>
+          <w:sz w:val="28"/>
+          <w:szCs w:val="28"/>
+          <w:lang w:val="en-US"/>
+        </w:rPr>
+      </w:pPr>
+      <w:r>
+        <w:rPr>
+          <w:noProof/>
+        </w:rPr>
+        <w:drawing>
+          <wp:inline distT="0" distB="0" distL="0" distR="0" wp14:anchorId="1312312A" wp14:editId="0BD81D35">
+            <wp:extent cx="3643824" cy="2844597"/>
+            <wp:effectExtent l="0" t="0" r="0" b="0"/>
+            <wp:docPr id="195530833" name="Picture 1"/>
+            <wp:cNvGraphicFramePr>
+              <a:graphicFrameLocks xmlns:a="http://schemas.openxmlformats.org/drawingml/2006/main" noChangeAspect="1"/>
+            </wp:cNvGraphicFramePr>
+            <a:graphic xmlns:a="http://schemas.openxmlformats.org/drawingml/2006/main">
+              <a:graphicData uri="http://schemas.openxmlformats.org/drawingml/2006/picture">
+                <pic:pic xmlns:pic="http://schemas.openxmlformats.org/drawingml/2006/picture">
+                  <pic:nvPicPr>
+                    <pic:cNvPr id="195530833" name=""/>
+                    <pic:cNvPicPr/>
+                  </pic:nvPicPr>
+                  <pic:blipFill>
+                    <a:blip r:embed="rId8"/>
+                    <a:stretch>
+                      <a:fillRect/>
+                    </a:stretch>
+                  </pic:blipFill>
+                  <pic:spPr>
+                    <a:xfrm>
+                      <a:off x="0" y="0"/>
+                      <a:ext cx="3643824" cy="2844597"/>
+                    </a:xfrm>
+                    <a:prstGeom prst="rect">
+                      <a:avLst/>
+                    </a:prstGeom>
+                  </pic:spPr>
+                </pic:pic>
+              </a:graphicData>
+            </a:graphic>
+          </wp:inline>
+        </w:drawing>
+      </w:r>
+    </w:p>
+    <w:p>
+      <w:pPr>
+        <w:pStyle w:val="ListParagraph"/>
+        <w:numPr>
+          <w:ilvl w:val="0"/>
+          <w:numId w:val="2"/>
+        </w:numPr>
+        <w:spacing w:line="240" w:lineRule="auto"/>
+        <w:rPr>
+          <w:sz w:val="28"/>
+          <w:szCs w:val="28"/>
+          <w:lang w:val="en-US"/>
+        </w:rPr>
+      </w:pPr>
+      <w:r>
+        <w:rPr>
+          <w:sz w:val="28"/>
+          <w:szCs w:val="28"/>
+          <w:lang w:val="en-US"/>
+        </w:rPr>
+        <w:lastRenderedPageBreak/>
+        <w:t>Now first what you should do is select your save location by</w:t>
+      </w:r>
+      <w:r>
+        <w:rPr>
+          <w:sz w:val="28"/>
+          <w:szCs w:val="28"/>
+          <w:lang w:val="en-US"/>
+        </w:rPr>
+        <w:t xml:space="preserve"> clic</w:t>
+      </w:r>
+      <w:r>
+        <w:rPr>
+          <w:sz w:val="28"/>
+          <w:szCs w:val="28"/>
+          <w:lang w:val="en-US"/>
+        </w:rPr>
+        <w:t>king the “Select Save Location” button and creating a folder in the location where you want your created graphs and data to go</w:t>
+      </w:r>
+    </w:p>
+    <w:p>
+      <w:pPr>
+        <w:pStyle w:val="ListParagraph"/>
+        <w:numPr>
+          <w:ilvl w:val="0"/>
+          <w:numId w:val="2"/>
+        </w:numPr>
+        <w:spacing w:line="240" w:lineRule="auto"/>
+        <w:rPr>
+          <w:sz w:val="28"/>
+          <w:szCs w:val="28"/>
+          <w:lang w:val="en-US"/>
+        </w:rPr>
+      </w:pPr>
+      <w:r>
+        <w:rPr>
+          <w:sz w:val="28"/>
+          <w:szCs w:val="28"/>
+          <w:lang w:val="en-US"/>
+        </w:rPr>
+        <w:t>Now we want to import the data that we want to analyze</w:t>
+      </w:r>
+      <w:r>
+        <w:rPr>
+          <w:sz w:val="28"/>
+          <w:szCs w:val="28"/>
+          <w:lang w:val="en-US"/>
+        </w:rPr>
+        <w:t>, to do this click the “Load File” button</w:t>
+      </w:r>
+      <w:r>
+        <w:rPr>
+          <w:sz w:val="28"/>
+          <w:szCs w:val="28"/>
+          <w:lang w:val="en-US"/>
+        </w:rPr>
+        <w:t xml:space="preserve"> </w:t>
+      </w:r>
+    </w:p>
+    <w:p>
+      <w:pPr>
+        <w:pStyle w:val="ListParagraph"/>
+        <w:numPr>
+          <w:ilvl w:val="0"/>
+          <w:numId w:val="2"/>
+        </w:numPr>
+        <w:spacing w:line="240" w:lineRule="auto"/>
+        <w:rPr>
+          <w:sz w:val="28"/>
+          <w:szCs w:val="28"/>
+          <w:lang w:val="en-US"/>
+        </w:rPr>
+      </w:pPr>
+      <w:r>
+        <w:rPr>
+          <w:sz w:val="28"/>
+          <w:szCs w:val="28"/>
+          <w:lang w:val="en-US"/>
+        </w:rPr>
+        <w:t>The data we want to use comes from the Xcalibur software and looks like this</w:t>
+      </w:r>
+      <w:r>
+        <w:rPr>
+          <w:sz w:val="28"/>
+          <w:szCs w:val="28"/>
+          <w:lang w:val="en-US"/>
+        </w:rPr>
+        <w:t xml:space="preserve"> (you can also see this if you </w:t>
+      </w:r>
+      <w:bookmarkStart w:id="0" w:name="_Int_YSc5NgEO"/>
+      <w:r>
+        <w:rPr>
+          <w:sz w:val="28"/>
+          <w:szCs w:val="28"/>
+          <w:lang w:val="en-US"/>
+        </w:rPr>
+        <w:t>open up</w:t>
+      </w:r>
+      <w:bookmarkEnd w:id="0"/>
+      <w:r>
+        <w:rPr>
+          <w:sz w:val="28"/>
+          <w:szCs w:val="28"/>
+          <w:lang w:val="en-US"/>
+        </w:rPr>
+        <w:t xml:space="preserve"> the excel sheet in the sample data file)</w:t>
+      </w:r>
+    </w:p>
+    <w:p>
+      <w:pPr>
+        <w:spacing w:line="240" w:lineRule="auto"/>
+        <w:rPr>
+          <w:sz w:val="28"/>
+          <w:szCs w:val="28"/>
+          <w:lang w:val="en-US"/>
+        </w:rPr>
+      </w:pPr>
+      <w:r>
+        <w:rPr>
+          <w:sz w:val="28"/>
+          <w:szCs w:val="28"/>
+          <w:lang w:val="en-US"/>
+        </w:rPr>
+        <w:drawing>
+          <wp:inline distT="0" distB="0" distL="0" distR="0" wp14:anchorId="77BF0EBD" wp14:editId="77A5687C">
+            <wp:extent cx="3258005" cy="3781953"/>
+            <wp:effectExtent l="0" t="0" r="0" b="9525"/>
+            <wp:docPr id="437627938" name="Picture 1"/>
+            <wp:cNvGraphicFramePr>
+              <a:graphicFrameLocks xmlns:a="http://schemas.openxmlformats.org/drawingml/2006/main" noChangeAspect="1"/>
+            </wp:cNvGraphicFramePr>
+            <a:graphic xmlns:a="http://schemas.openxmlformats.org/drawingml/2006/main">
+              <a:graphicData uri="http://schemas.openxmlformats.org/drawingml/2006/picture">
+                <pic:pic xmlns:pic="http://schemas.openxmlformats.org/drawingml/2006/picture">
+                  <pic:nvPicPr>
+                    <pic:cNvPr id="437627938" name=""/>
+                    <pic:cNvPicPr/>
+                  </pic:nvPicPr>
+                  <pic:blipFill>
+                    <a:blip r:embed="rId9"/>
+                    <a:stretch>
+                      <a:fillRect/>
+                    </a:stretch>
+                  </pic:blipFill>
+                  <pic:spPr>
+                    <a:xfrm>
+                      <a:off x="0" y="0"/>
+                      <a:ext cx="3258005" cy="3781953"/>
+                    </a:xfrm>
+                    <a:prstGeom prst="rect">
+                      <a:avLst/>
+                    </a:prstGeom>
+                  </pic:spPr>
+                </pic:pic>
+              </a:graphicData>
+            </a:graphic>
+          </wp:inline>
+        </w:drawing>
+      </w:r>
+    </w:p>
+    <w:p>
+      <w:pPr>
+        <w:pStyle w:val="ListParagraph"/>
+        <w:numPr>
+          <w:ilvl w:val="0"/>
+          <w:numId w:val="2"/>
+        </w:numPr>
+        <w:spacing w:line="240" w:lineRule="auto"/>
+        <w:rPr>
+          <w:sz w:val="28"/>
+          <w:szCs w:val="28"/>
+          <w:lang w:val="en-US"/>
+        </w:rPr>
+      </w:pPr>
+      <w:r>
+        <w:rPr>
+          <w:sz w:val="28"/>
+          <w:szCs w:val="28"/>
+          <w:lang w:val="en-US"/>
+        </w:rPr>
+        <w:t>Your data must be in this form for this app to work so make sure the source of your data has all these columns</w:t>
+      </w:r>
+    </w:p>
+    <w:p>
+      <w:pPr>
+        <w:pStyle w:val="ListParagraph"/>
+        <w:numPr>
+          <w:ilvl w:val="0"/>
+          <w:numId w:val="2"/>
+        </w:numPr>
+        <w:spacing w:line="240" w:lineRule="auto"/>
+        <w:rPr>
+          <w:sz w:val="28"/>
+          <w:szCs w:val="28"/>
+          <w:lang w:val="en-US"/>
+        </w:rPr>
+      </w:pPr>
+      <w:r>
+        <w:rPr>
+          <w:sz w:val="28"/>
+          <w:szCs w:val="28"/>
+          <w:lang w:val="en-US"/>
+        </w:rPr>
+        <w:t xml:space="preserve">Notice how there are 6 rows before the </w:t>
+      </w:r>
+      <w:r>
+        <w:rPr>
+          <w:sz w:val="28"/>
+          <w:szCs w:val="28"/>
+          <w:lang w:val="en-US"/>
+        </w:rPr>
+        <w:t xml:space="preserve">actual column headers, this value needs to be the same in the excel file as in the </w:t>
+      </w:r>
+      <w:r>
+        <w:rPr>
+          <w:sz w:val="28"/>
+          <w:szCs w:val="28"/>
+          <w:lang w:val="en-US"/>
+        </w:rPr>
+        <w:t>app as seen here (if you have a different amount of rows above the headers just change it accordingly</w:t>
+      </w:r>
+    </w:p>
+    <w:p>
+      <w:pPr>
+        <w:spacing w:line="240" w:lineRule="auto"/>
+        <w:rPr>
+          <w:sz w:val="28"/>
+          <w:szCs w:val="28"/>
+          <w:lang w:val="en-US"/>
+        </w:rPr>
+      </w:pPr>
+      <w:r>
+        <w:rPr>
+          <w:sz w:val="28"/>
+          <w:szCs w:val="28"/>
+          <w:lang w:val="en-US"/>
+        </w:rPr>
+        <w:drawing>
+          <wp:inline distT="0" distB="0" distL="0" distR="0" wp14:anchorId="5C054398" wp14:editId="50FEF4D6">
+            <wp:extent cx="1181265" cy="619211"/>
+            <wp:effectExtent l="0" t="0" r="0" b="9525"/>
+            <wp:docPr id="226210928" name="Picture 1"/>
+            <wp:cNvGraphicFramePr>
+              <a:graphicFrameLocks xmlns:a="http://schemas.openxmlformats.org/drawingml/2006/main" noChangeAspect="1"/>
+            </wp:cNvGraphicFramePr>
+            <a:graphic xmlns:a="http://schemas.openxmlformats.org/drawingml/2006/main">
+              <a:graphicData uri="http://schemas.openxmlformats.org/drawingml/2006/picture">
+                <pic:pic xmlns:pic="http://schemas.openxmlformats.org/drawingml/2006/picture">
+                  <pic:nvPicPr>
+                    <pic:cNvPr id="226210928" name=""/>
+                    <pic:cNvPicPr/>
+                  </pic:nvPicPr>
+                  <pic:blipFill>
+                    <a:blip r:embed="rId10"/>
+                    <a:stretch>
+                      <a:fillRect/>
+                    </a:stretch>
+                  </pic:blipFill>
+                  <pic:spPr>
+                    <a:xfrm>
+                      <a:off x="0" y="0"/>
+                      <a:ext cx="1181265" cy="619211"/>
+                    </a:xfrm>
+                    <a:prstGeom prst="rect">
+                      <a:avLst/>
+                    </a:prstGeom>
+                  </pic:spPr>
+                </pic:pic>
+              </a:graphicData>
+            </a:graphic>
+          </wp:inline>
+        </w:drawing>
+      </w:r>
+    </w:p>
+    <w:p>
+      <w:pPr>
+        <w:spacing w:line="240" w:lineRule="auto"/>
+        <w:rPr>
+          <w:sz w:val="28"/>
+          <w:szCs w:val="28"/>
+          <w:lang w:val="en-US"/>
+        </w:rPr>
+      </w:pPr>
+    </w:p>
+    <w:p>
+      <w:pPr>
+        <w:pStyle w:val="ListParagraph"/>
+        <w:numPr>
+          <w:ilvl w:val="0"/>
+          <w:numId w:val="2"/>
+        </w:numPr>
+        <w:spacing w:line="240" w:lineRule="auto"/>
+        <w:rPr>
+          <w:sz w:val="28"/>
+          <w:szCs w:val="28"/>
+          <w:lang w:val="en-US"/>
+        </w:rPr>
+      </w:pPr>
+      <w:r>
+        <w:rPr>
+          <w:sz w:val="28"/>
+          <w:szCs w:val="28"/>
+          <w:lang w:val="en-US"/>
+        </w:rPr>
+        <w:lastRenderedPageBreak/>
+        <w:t>Once your data has loaded in successfully, you should see this popup</w:t>
+      </w:r>
+      <w:r>
+        <w:rPr>
+          <w:sz w:val="28"/>
+          <w:szCs w:val="28"/>
+          <w:lang w:val="en-US"/>
+        </w:rPr>
+        <w:t xml:space="preserve"> (if the app crashes or something doesn’t work, reopen the app and make sure your data is in the right form</w:t>
+      </w:r>
+      <w:r>
+        <w:rPr>
+          <w:sz w:val="28"/>
+          <w:szCs w:val="28"/>
+          <w:lang w:val="en-US"/>
+        </w:rPr>
+        <w:t xml:space="preserve"> – ALSO THE EXCEL SHEET CANNOT BE OPEN WHEN YOU LOAD IT IN SO CLOSE IT BEFORE LOADING</w:t>
+      </w:r>
+    </w:p>
+    <w:p>
+      <w:pPr>
+        <w:spacing w:line="240" w:lineRule="auto"/>
+        <w:rPr>
+          <w:sz w:val="28"/>
+          <w:szCs w:val="28"/>
+          <w:lang w:val="en-US"/>
+        </w:rPr>
+      </w:pPr>
+      <w:r>
+        <w:rPr>
+          <w:sz w:val="28"/>
+          <w:szCs w:val="28"/>
+          <w:lang w:val="en-US"/>
+        </w:rPr>
+        <w:drawing>
+          <wp:inline distT="0" distB="0" distL="0" distR="0" wp14:anchorId="668EE057" wp14:editId="12415A87">
+            <wp:extent cx="4734586" cy="1524213"/>
+            <wp:effectExtent l="0" t="0" r="0" b="0"/>
+            <wp:docPr id="1557516758" name="Picture 1"/>
+            <wp:cNvGraphicFramePr>
+              <a:graphicFrameLocks xmlns:a="http://schemas.openxmlformats.org/drawingml/2006/main" noChangeAspect="1"/>
+            </wp:cNvGraphicFramePr>
+            <a:graphic xmlns:a="http://schemas.openxmlformats.org/drawingml/2006/main">
+              <a:graphicData uri="http://schemas.openxmlformats.org/drawingml/2006/picture">
+                <pic:pic xmlns:pic="http://schemas.openxmlformats.org/drawingml/2006/picture">
+                  <pic:nvPicPr>
+                    <pic:cNvPr id="1557516758" name=""/>
+                    <pic:cNvPicPr/>
+                  </pic:nvPicPr>
+                  <pic:blipFill>
+                    <a:blip r:embed="rId11"/>
+                    <a:stretch>
+                      <a:fillRect/>
+                    </a:stretch>
+                  </pic:blipFill>
+                  <pic:spPr>
+                    <a:xfrm>
+                      <a:off x="0" y="0"/>
+                      <a:ext cx="4734586" cy="1524213"/>
+                    </a:xfrm>
+                    <a:prstGeom prst="rect">
+                      <a:avLst/>
+                    </a:prstGeom>
+                  </pic:spPr>
+                </pic:pic>
+              </a:graphicData>
+            </a:graphic>
+          </wp:inline>
+        </w:drawing>
+      </w:r>
+    </w:p>
+    <w:p>
+      <w:pPr>
+        <w:spacing w:line="240" w:lineRule="auto"/>
+        <w:rPr>
+          <w:sz w:val="28"/>
+          <w:szCs w:val="28"/>
+          <w:lang w:val="en-US"/>
+        </w:rPr>
+      </w:pPr>
+    </w:p>
+    <w:p>
+      <w:pPr>
+        <w:spacing w:line="240" w:lineRule="auto"/>
+        <w:rPr>
+          <w:b/>
+          <w:bCs/>
+          <w:sz w:val="28"/>
+          <w:szCs w:val="28"/>
+          <w:lang w:val="en-US"/>
+        </w:rPr>
+      </w:pPr>
+      <w:r>
+        <w:rPr>
+          <w:b/>
+          <w:bCs/>
+          <w:sz w:val="28"/>
+          <w:szCs w:val="28"/>
+          <w:lang w:val="en-US"/>
+        </w:rPr>
+        <w:t xml:space="preserve">USING THE APP TO </w:t>
+      </w:r>
+      <w:r>
+        <w:rPr>
+          <w:b/>
+          <w:bCs/>
+          <w:sz w:val="28"/>
+          <w:szCs w:val="28"/>
+          <w:lang w:val="en-US"/>
+        </w:rPr>
+        <w:t>LOOK AT SPECTRA</w:t>
+      </w:r>
+    </w:p>
+    <w:p>
+      <w:pPr>
+        <w:pStyle w:val="ListParagraph"/>
+        <w:numPr>
+          <w:ilvl w:val="0"/>
+          <w:numId w:val="3"/>
+        </w:numPr>
+        <w:spacing w:line="240" w:lineRule="auto"/>
+        <w:rPr>
+          <w:sz w:val="28"/>
+          <w:szCs w:val="28"/>
+          <w:lang w:val="en-US"/>
+        </w:rPr>
+      </w:pPr>
+      <w:r>
+        <w:rPr>
+          <w:sz w:val="28"/>
+          <w:szCs w:val="28"/>
+          <w:lang w:val="en-US"/>
+        </w:rPr>
+        <w:t xml:space="preserve">If you want to look at what one of the mass spectra looks like, </w:t>
+      </w:r>
+      <w:r>
+        <w:rPr>
+          <w:sz w:val="28"/>
+          <w:szCs w:val="28"/>
+          <w:lang w:val="en-US"/>
+        </w:rPr>
+        <w:t>double click on the sample that you want to look at</w:t>
+      </w:r>
+      <w:r>
+        <w:rPr>
+          <w:sz w:val="28"/>
+          <w:szCs w:val="28"/>
+          <w:lang w:val="en-US"/>
+        </w:rPr>
+        <w:t>.</w:t>
+      </w:r>
+    </w:p>
+    <w:p>
+      <w:pPr>
+        <w:spacing w:line="240" w:lineRule="auto"/>
+        <w:rPr>
+          <w:sz w:val="28"/>
+          <w:szCs w:val="28"/>
+          <w:lang w:val="en-US"/>
+        </w:rPr>
+      </w:pPr>
+      <w:r>
+        <w:rPr>
+          <w:noProof/>
+          <w:sz w:val="28"/>
+          <w:szCs w:val="28"/>
+          <w:lang w:val="en-US"/>
+        </w:rPr>
+        <mc:AlternateContent>
+          <mc:Choice Requires="wps">
+            <w:drawing>
+              <wp:anchor distT="0" distB="0" distL="114300" distR="114300" simplePos="0" relativeHeight="251658240" behindDoc="0" locked="0" layoutInCell="1" allowOverlap="1" wp14:anchorId="0BF3879F" wp14:editId="71E759F9">
+                <wp:simplePos x="0" y="0"/>
+                <wp:positionH relativeFrom="column">
+                  <wp:posOffset>-666750</wp:posOffset>
+                </wp:positionH>
+                <wp:positionV relativeFrom="paragraph">
+                  <wp:posOffset>994410</wp:posOffset>
+                </wp:positionV>
+                <wp:extent cx="742950" cy="285750"/>
+                <wp:effectExtent l="0" t="19050" r="38100" b="38100"/>
+                <wp:wrapNone/>
+                <wp:docPr id="1326161269" name="Arrow: Right 2"/>
+                <wp:cNvGraphicFramePr/>
+                <a:graphic xmlns:a="http://schemas.openxmlformats.org/drawingml/2006/main">
+                  <a:graphicData uri="http://schemas.microsoft.com/office/word/2010/wordprocessingShape">
+                    <wps:wsp>
+                      <wps:cNvSpPr/>
+                      <wps:spPr>
+                        <a:xfrm>
+                          <a:off x="0" y="0"/>
+                          <a:ext cx="742950" cy="285750"/>
+                        </a:xfrm>
+                        <a:prstGeom prst="rightArrow">
+                          <a:avLst/>
+                        </a:prstGeom>
+                        <a:solidFill>
+                          <a:srgbClr val="C00000"/>
+                        </a:solidFill>
+                      </wps:spPr>
+                      <wps:style>
+                        <a:lnRef idx="2">
+                          <a:schemeClr val="accent1">
+                            <a:shade val="15000"/>
+                          </a:schemeClr>
+                        </a:lnRef>
+                        <a:fillRef idx="1">
+                          <a:schemeClr val="accent1"/>
+                        </a:fillRef>
+                        <a:effectRef idx="0">
+                          <a:schemeClr val="accent1"/>
+                        </a:effectRef>
+                        <a:fontRef idx="minor">
+                          <a:schemeClr val="lt1"/>
+                        </a:fontRef>
+                      </wps:style>
+                      <wps:bodyPr rot="0" spcFirstLastPara="0" vertOverflow="overflow" horzOverflow="overflow" vert="horz" wrap="square" lIns="91440" tIns="45720" rIns="91440" bIns="45720" numCol="1" spcCol="0" rtlCol="0" fromWordArt="0" anchor="ctr" anchorCtr="0" forceAA="0" compatLnSpc="1">
+                        <a:prstTxWarp prst="textNoShape">
+                          <a:avLst/>
+                        </a:prstTxWarp>
+                        <a:noAutofit/>
+                      </wps:bodyPr>
+                    </wps:wsp>
+                  </a:graphicData>
+                </a:graphic>
+              </wp:anchor>
+            </w:drawing>
+          </mc:Choice>
+          <mc:Fallback>
+            <w:pict>
+              <v:shapetype w14:anchorId="39FC96DE" id="_x0000_t13" coordsize="21600,21600" o:spt="13" adj="16200,5400" path="m@0,l@0@1,0@1,0@2@0@2@0,21600,21600,10800xe">
+                <v:stroke joinstyle="miter"/>
+                <v:formulas>
+                  <v:f eqn="val #0"/>
+                  <v:f eqn="val #1"/>
+                  <v:f eqn="sum height 0 #1"/>
+                  <v:f eqn="sum 10800 0 #1"/>
+                  <v:f eqn="sum width 0 #0"/>
+                  <v:f eqn="prod @4 @3 10800"/>
+                  <v:f eqn="sum width 0 @5"/>
+                </v:formulas>
+                <v:path o:connecttype="custom" o:connectlocs="@0,0;0,10800;@0,21600;21600,10800" o:connectangles="270,180,90,0" textboxrect="0,@1,@6,@2"/>
+                <v:handles>
+                  <v:h position="#0,#1" xrange="0,21600" yrange="0,10800"/>
+                </v:handles>
+              </v:shapetype>
+              <v:shape id="Arrow: Right 2" o:spid="_x0000_s1026" type="#_x0000_t13" style="position:absolute;margin-left:-52.5pt;margin-top:78.3pt;width:58.5pt;height:22.5pt;z-index:251658240;visibility:visible;mso-wrap-style:square;mso-wrap-distance-left:9pt;mso-wrap-distance-top:0;mso-wrap-distance-right:9pt;mso-wrap-distance-bottom:0;mso-position-horizontal:absolute;mso-position-horizontal-relative:text;mso-position-vertical:absolute;mso-position-vertical-relative:text;v-text-anchor:middle" o:gfxdata="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" adj="17446" fillcolor="#c00000" strokecolor="#030e13 [484]" strokeweight="1.5pt"/>
+            </w:pict>
+          </mc:Fallback>
+        </mc:AlternateContent>
+      </w:r>
+      <w:r>
+        <w:rPr>
+          <w:sz w:val="28"/>
+          <w:szCs w:val="28"/>
+          <w:lang w:val="en-US"/>
+        </w:rPr>
+        <w:drawing>
+          <wp:inline distT="0" distB="0" distL="0" distR="0" wp14:anchorId="5F85BD9B" wp14:editId="28C7BB80">
+            <wp:extent cx="3277057" cy="2362530"/>
+            <wp:effectExtent l="0" t="0" r="0" b="0"/>
+            <wp:docPr id="1976617054" name="Picture 1"/>
+            <wp:cNvGraphicFramePr>
+              <a:graphicFrameLocks xmlns:a="http://schemas.openxmlformats.org/drawingml/2006/main" noChangeAspect="1"/>
+            </wp:cNvGraphicFramePr>
+            <a:graphic xmlns:a="http://schemas.openxmlformats.org/drawingml/2006/main">
+              <a:graphicData uri="http://schemas.openxmlformats.org/drawingml/2006/picture">
+                <pic:pic xmlns:pic="http://schemas.openxmlformats.org/drawingml/2006/picture">
+                  <pic:nvPicPr>
+                    <pic:cNvPr id="1976617054" name=""/>
+                    <pic:cNvPicPr/>
+                  </pic:nvPicPr>
+                  <pic:blipFill>
+                    <a:blip r:embed="rId12"/>
+                    <a:stretch>
+                      <a:fillRect/>
+                    </a:stretch>
+                  </pic:blipFill>
+                  <pic:spPr>
+                    <a:xfrm>
+                      <a:off x="0" y="0"/>
+                      <a:ext cx="3277057" cy="2362530"/>
+                    </a:xfrm>
+                    <a:prstGeom prst="rect">
+                      <a:avLst/>
+                    </a:prstGeom>
+                  </pic:spPr>
+                </pic:pic>
+              </a:graphicData>
+            </a:graphic>
+          </wp:inline>
+        </w:drawing>
+      </w:r>
+    </w:p>
+    <w:p>
+      <w:pPr>
+        <w:pStyle w:val="ListParagraph"/>
+        <w:numPr>
+          <w:ilvl w:val="0"/>
+          <w:numId w:val="3"/>
+        </w:numPr>
+        <w:spacing w:line="240" w:lineRule="auto"/>
+        <w:rPr>
+          <w:sz w:val="28"/>
+          <w:szCs w:val="28"/>
+          <w:lang w:val="en-US"/>
+        </w:rPr>
+      </w:pPr>
+      <w:r>
+        <w:rPr>
+          <w:sz w:val="28"/>
+          <w:szCs w:val="28"/>
+          <w:lang w:val="en-US"/>
+        </w:rPr>
+        <w:t>This will bring up a pop up that shows what that spectrum looks like</w:t>
+      </w:r>
+      <w:r>
+        <w:rPr>
+          <w:sz w:val="28"/>
+          <w:szCs w:val="28"/>
+          <w:lang w:val="en-US"/>
+        </w:rPr>
+        <w:t>. From here you can save</w:t>
+      </w:r>
+      <w:r>
+        <w:rPr>
+          <w:sz w:val="28"/>
+          <w:szCs w:val="28"/>
+          <w:lang w:val="en-US"/>
+        </w:rPr>
+        <w:t xml:space="preserve"> each</w:t>
+      </w:r>
+      <w:r>
+        <w:rPr>
+          <w:sz w:val="28"/>
+          <w:szCs w:val="28"/>
+          <w:lang w:val="en-US"/>
+        </w:rPr>
+        <w:t xml:space="preserve"> figure or if you have save</w:t>
+      </w:r>
+      <w:r>
+        <w:rPr>
+          <w:sz w:val="28"/>
+          <w:szCs w:val="28"/>
+          <w:lang w:val="en-US"/>
+        </w:rPr>
+        <w:t xml:space="preserve"> graph</w:t>
+      </w:r>
+      <w:r>
+        <w:rPr>
+          <w:sz w:val="28"/>
+          <w:szCs w:val="28"/>
+          <w:lang w:val="en-US"/>
+        </w:rPr>
+        <w:t xml:space="preserve">s checked it will automatically </w:t>
+      </w:r>
+      <w:r>
+        <w:rPr>
+          <w:sz w:val="28"/>
+          <w:szCs w:val="28"/>
+          <w:lang w:val="en-US"/>
+        </w:rPr>
+        <w:t xml:space="preserve">save them </w:t>
+      </w:r>
+      <w:r>
+        <w:rPr>
+          <w:sz w:val="28"/>
+          <w:szCs w:val="28"/>
+          <w:lang w:val="en-US"/>
+        </w:rPr>
+        <w:t>and you can view them in the folder you saved them in</w:t>
+      </w:r>
+    </w:p>
+    <w:p>
+      <w:pPr>
+        <w:spacing w:line="240" w:lineRule="auto"/>
+        <w:rPr>
+          <w:sz w:val="28"/>
+          <w:szCs w:val="28"/>
+          <w:lang w:val="en-US"/>
+        </w:rPr>
+      </w:pPr>
+    </w:p>
+    <w:p>
+      <w:pPr>
+        <w:spacing w:line="240" w:lineRule="auto"/>
+        <w:rPr>
+          <w:b/>
+          <w:bCs/>
+          <w:sz w:val="28"/>
+          <w:szCs w:val="28"/>
+          <w:lang w:val="en-US"/>
+        </w:rPr>
+      </w:pPr>
+      <w:r>
+        <w:rPr>
+          <w:b/>
+          <w:bCs/>
+          <w:sz w:val="28"/>
+          <w:szCs w:val="28"/>
+          <w:lang w:val="en-US"/>
+        </w:rPr>
+        <w:lastRenderedPageBreak/>
+        <w:t>SPECTRAL SUBTRACTION</w:t>
+      </w:r>
+    </w:p>
+    <w:p>
+      <w:pPr>
+        <w:pStyle w:val="ListParagraph"/>
+        <w:spacing w:line="240" w:lineRule="auto"/>
+        <w:rPr>
+          <w:sz w:val="28"/>
+          <w:szCs w:val="28"/>
+          <w:lang w:val="en-US"/>
+        </w:rPr>
+      </w:pPr>
+    </w:p>
+    <w:p>
+      <w:pPr>
+        <w:spacing w:line="240" w:lineRule="auto"/>
+        <w:rPr>
+          <w:sz w:val="28"/>
+          <w:szCs w:val="28"/>
+          <w:lang w:val="en-US"/>
+        </w:rPr>
+      </w:pPr>
     </w:p>
     <w:p>
       <w:pPr>
@@ -125,7 +1105,7 @@
       </w:pPr>
     </w:p>
     <w:sectPr>
-      <w:headerReference w:type="default" r:id="rId7"/>
+      <w:headerReference w:type="default" r:id="rId13"/>
       <w:pgSz w:w="12240" w:h="15840"/>
       <w:pgMar w:top="1440" w:right="1440" w:bottom="1440" w:left="1440" w:header="708" w:footer="708" w:gutter="0"/>
       <w:cols w:space="708"/>
@@ -202,28 +1182,22 @@
         <w:iCs/>
         <w:lang w:val="en-US"/>
       </w:rPr>
-      <w:t xml:space="preserve">If you have any </w:t>
-    </w:r>
-    <w:proofErr w:type="gramStart"/>
-    <w:r>
-      <w:rPr>
-        <w:i/>
-        <w:iCs/>
-        <w:lang w:val="en-US"/>
-      </w:rPr>
-      <w:t>questions</w:t>
-    </w:r>
-    <w:proofErr w:type="gramEnd"/>
-    <w:r>
-      <w:rPr>
-        <w:i/>
-        <w:iCs/>
-        <w:lang w:val="en-US"/>
-      </w:rPr>
-      <w:t xml:space="preserve"> please email me @ jbarwege@gmail.com</w:t>
+      <w:t>If you have any questions please email me @ jbarwege@gmail.com</w:t>
     </w:r>
   </w:p>
 </w:hdr>
+</file>
+
+<file path=word/intelligence2.xml><?xml version="1.0" encoding="utf-8"?>
+<int2:intelligence xmlns:int2="http://schemas.microsoft.com/office/intelligence/2020/intelligence" xmlns:oel="http://schemas.microsoft.com/office/2019/extlst">
+  <int2:observations>
+    <int2:bookmark int2:bookmarkName="_Int_YSc5NgEO" int2:invalidationBookmarkName="" int2:hashCode="FtKmvXqsPlW8Nr" int2:id="A6Xb18aN">
+      <int2:state int2:value="Rejected" int2:type="style"/>
+    </int2:bookmark>
+  </int2:observations>
+  <int2:intelligenceSettings/>
+  <int2:onDemandWorkflows/>
+</int2:intelligence>
 </file>
 
 <file path=word/numbering.xml><?xml version="1.0" encoding="utf-8"?>
@@ -317,8 +1291,192 @@
       </w:pPr>
     </w:lvl>
   </w:abstractNum>
+  <w:abstractNum w:abstractNumId="1" w15:restartNumberingAfterBreak="0">
+    <w:nsid w:val="20DB1C6C"/>
+    <w:multiLevelType w:val="hybridMultilevel"/>
+    <w:tmpl w:val="208620EA"/>
+    <w:lvl w:ilvl="0" w:tplc="1009000F">
+      <w:start w:val="1"/>
+      <w:numFmt w:val="decimal"/>
+      <w:lvlText w:val="%1."/>
+      <w:lvlJc w:val="left"/>
+      <w:pPr>
+        <w:ind w:left="720" w:hanging="360"/>
+      </w:pPr>
+      <w:rPr>
+        <w:rFonts w:hint="default"/>
+      </w:rPr>
+    </w:lvl>
+    <w:lvl w:ilvl="1" w:tplc="10090019" w:tentative="1">
+      <w:start w:val="1"/>
+      <w:numFmt w:val="lowerLetter"/>
+      <w:lvlText w:val="%2."/>
+      <w:lvlJc w:val="left"/>
+      <w:pPr>
+        <w:ind w:left="1440" w:hanging="360"/>
+      </w:pPr>
+    </w:lvl>
+    <w:lvl w:ilvl="2" w:tplc="1009001B" w:tentative="1">
+      <w:start w:val="1"/>
+      <w:numFmt w:val="lowerRoman"/>
+      <w:lvlText w:val="%3."/>
+      <w:lvlJc w:val="right"/>
+      <w:pPr>
+        <w:ind w:left="2160" w:hanging="180"/>
+      </w:pPr>
+    </w:lvl>
+    <w:lvl w:ilvl="3" w:tplc="1009000F" w:tentative="1">
+      <w:start w:val="1"/>
+      <w:numFmt w:val="decimal"/>
+      <w:lvlText w:val="%4."/>
+      <w:lvlJc w:val="left"/>
+      <w:pPr>
+        <w:ind w:left="2880" w:hanging="360"/>
+      </w:pPr>
+    </w:lvl>
+    <w:lvl w:ilvl="4" w:tplc="10090019" w:tentative="1">
+      <w:start w:val="1"/>
+      <w:numFmt w:val="lowerLetter"/>
+      <w:lvlText w:val="%5."/>
+      <w:lvlJc w:val="left"/>
+      <w:pPr>
+        <w:ind w:left="3600" w:hanging="360"/>
+      </w:pPr>
+    </w:lvl>
+    <w:lvl w:ilvl="5" w:tplc="1009001B" w:tentative="1">
+      <w:start w:val="1"/>
+      <w:numFmt w:val="lowerRoman"/>
+      <w:lvlText w:val="%6."/>
+      <w:lvlJc w:val="right"/>
+      <w:pPr>
+        <w:ind w:left="4320" w:hanging="180"/>
+      </w:pPr>
+    </w:lvl>
+    <w:lvl w:ilvl="6" w:tplc="1009000F" w:tentative="1">
+      <w:start w:val="1"/>
+      <w:numFmt w:val="decimal"/>
+      <w:lvlText w:val="%7."/>
+      <w:lvlJc w:val="left"/>
+      <w:pPr>
+        <w:ind w:left="5040" w:hanging="360"/>
+      </w:pPr>
+    </w:lvl>
+    <w:lvl w:ilvl="7" w:tplc="10090019" w:tentative="1">
+      <w:start w:val="1"/>
+      <w:numFmt w:val="lowerLetter"/>
+      <w:lvlText w:val="%8."/>
+      <w:lvlJc w:val="left"/>
+      <w:pPr>
+        <w:ind w:left="5760" w:hanging="360"/>
+      </w:pPr>
+    </w:lvl>
+    <w:lvl w:ilvl="8" w:tplc="1009001B" w:tentative="1">
+      <w:start w:val="1"/>
+      <w:numFmt w:val="lowerRoman"/>
+      <w:lvlText w:val="%9."/>
+      <w:lvlJc w:val="right"/>
+      <w:pPr>
+        <w:ind w:left="6480" w:hanging="180"/>
+      </w:pPr>
+    </w:lvl>
+  </w:abstractNum>
+  <w:abstractNum w:abstractNumId="2" w15:restartNumberingAfterBreak="0">
+    <w:nsid w:val="3C1E03BD"/>
+    <w:multiLevelType w:val="hybridMultilevel"/>
+    <w:tmpl w:val="B700FF24"/>
+    <w:lvl w:ilvl="0" w:tplc="1009000F">
+      <w:start w:val="1"/>
+      <w:numFmt w:val="decimal"/>
+      <w:lvlText w:val="%1."/>
+      <w:lvlJc w:val="left"/>
+      <w:pPr>
+        <w:ind w:left="720" w:hanging="360"/>
+      </w:pPr>
+      <w:rPr>
+        <w:rFonts w:hint="default"/>
+      </w:rPr>
+    </w:lvl>
+    <w:lvl w:ilvl="1" w:tplc="10090019" w:tentative="1">
+      <w:start w:val="1"/>
+      <w:numFmt w:val="lowerLetter"/>
+      <w:lvlText w:val="%2."/>
+      <w:lvlJc w:val="left"/>
+      <w:pPr>
+        <w:ind w:left="1440" w:hanging="360"/>
+      </w:pPr>
+    </w:lvl>
+    <w:lvl w:ilvl="2" w:tplc="1009001B" w:tentative="1">
+      <w:start w:val="1"/>
+      <w:numFmt w:val="lowerRoman"/>
+      <w:lvlText w:val="%3."/>
+      <w:lvlJc w:val="right"/>
+      <w:pPr>
+        <w:ind w:left="2160" w:hanging="180"/>
+      </w:pPr>
+    </w:lvl>
+    <w:lvl w:ilvl="3" w:tplc="1009000F" w:tentative="1">
+      <w:start w:val="1"/>
+      <w:numFmt w:val="decimal"/>
+      <w:lvlText w:val="%4."/>
+      <w:lvlJc w:val="left"/>
+      <w:pPr>
+        <w:ind w:left="2880" w:hanging="360"/>
+      </w:pPr>
+    </w:lvl>
+    <w:lvl w:ilvl="4" w:tplc="10090019" w:tentative="1">
+      <w:start w:val="1"/>
+      <w:numFmt w:val="lowerLetter"/>
+      <w:lvlText w:val="%5."/>
+      <w:lvlJc w:val="left"/>
+      <w:pPr>
+        <w:ind w:left="3600" w:hanging="360"/>
+      </w:pPr>
+    </w:lvl>
+    <w:lvl w:ilvl="5" w:tplc="1009001B" w:tentative="1">
+      <w:start w:val="1"/>
+      <w:numFmt w:val="lowerRoman"/>
+      <w:lvlText w:val="%6."/>
+      <w:lvlJc w:val="right"/>
+      <w:pPr>
+        <w:ind w:left="4320" w:hanging="180"/>
+      </w:pPr>
+    </w:lvl>
+    <w:lvl w:ilvl="6" w:tplc="1009000F" w:tentative="1">
+      <w:start w:val="1"/>
+      <w:numFmt w:val="decimal"/>
+      <w:lvlText w:val="%7."/>
+      <w:lvlJc w:val="left"/>
+      <w:pPr>
+        <w:ind w:left="5040" w:hanging="360"/>
+      </w:pPr>
+    </w:lvl>
+    <w:lvl w:ilvl="7" w:tplc="10090019" w:tentative="1">
+      <w:start w:val="1"/>
+      <w:numFmt w:val="lowerLetter"/>
+      <w:lvlText w:val="%8."/>
+      <w:lvlJc w:val="left"/>
+      <w:pPr>
+        <w:ind w:left="5760" w:hanging="360"/>
+      </w:pPr>
+    </w:lvl>
+    <w:lvl w:ilvl="8" w:tplc="1009001B" w:tentative="1">
+      <w:start w:val="1"/>
+      <w:numFmt w:val="lowerRoman"/>
+      <w:lvlText w:val="%9."/>
+      <w:lvlJc w:val="right"/>
+      <w:pPr>
+        <w:ind w:left="6480" w:hanging="180"/>
+      </w:pPr>
+    </w:lvl>
+  </w:abstractNum>
   <w:num w:numId="1" w16cid:durableId="1607152572">
     <w:abstractNumId w:val="0"/>
+  </w:num>
+  <w:num w:numId="2" w16cid:durableId="1109277311">
+    <w:abstractNumId w:val="2"/>
+  </w:num>
+  <w:num w:numId="3" w16cid:durableId="638463909">
+    <w:abstractNumId w:val="1"/>
   </w:num>
 </w:numbering>
 </file>

</xml_diff>